<commit_message>
Paginate promoter poster and refine booking packet
</commit_message>
<xml_diff>
--- a/public/templates/reid-poole-music-booking-packet-template.docx
+++ b/public/templates/reid-poole-music-booking-packet-template.docx
@@ -8,27 +8,1486 @@
       </w:pPr>
       <w:r>
         <w:rPr>
+          <w:rFonts w:ascii="Georgia" w:hAnsi="Georgia"/>
           <w:b/>
-          <w:sz w:val="48"/>
+          <w:color w:val="263F38"/>
+          <w:sz w:val="60"/>
         </w:rPr>
         <w:t>REID POOLE MUSIC</w:t>
         <w:br/>
       </w:r>
       <w:r>
         <w:rPr>
-          <w:sz w:val="24"/>
+          <w:rFonts w:ascii="Arial" w:hAnsi="Arial"/>
+          <w:color w:val="B86432"/>
+          <w:sz w:val="32"/>
         </w:rPr>
-        <w:t>Luxury Booking Packet Template</w:t>
+        <w:t>Premier Booking Packet</w:t>
         <w:br/>
-        <w:t>Performance Agreement and Wedding Planning Questionnaire</w:t>
+      </w:r>
+      <w:r>
+        <w:rPr>
+          <w:rFonts w:ascii="Arial" w:hAnsi="Arial"/>
+          <w:color w:val="4F7870"/>
+          <w:sz w:val="22"/>
+        </w:rPr>
+        <w:t>Performance Agreement + Wedding Music Planning Questionnaire</w:t>
+      </w:r>
+    </w:p>
+    <w:p>
+      <w:r>
+        <w:t>Editable template for weddings, private events, venues, festivals, and corporate bookings. Replace placeholders, remove unused sections, and export the final version as PDF or DOCX.</w:t>
       </w:r>
     </w:p>
     <w:p>
       <w:pPr>
-        <w:jc w:val="center"/>
+        <w:pStyle w:val="Heading1"/>
       </w:pPr>
       <w:r>
-        <w:t>Elegant live music for weddings, private events, venues, festivals, and corporate celebrations.</w:t>
+        <w:rPr>
+          <w:rFonts w:ascii="Georgia" w:hAnsi="Georgia"/>
+          <w:color w:val="263F38"/>
+        </w:rPr>
+        <w:t>Quick edit fields</w:t>
+      </w:r>
+    </w:p>
+    <w:tbl>
+      <w:tblPr>
+        <w:tblStyle w:val="TableGrid"/>
+        <w:tblW w:type="auto" w:w="0"/>
+        <w:tblLook w:firstColumn="1" w:firstRow="1" w:lastColumn="0" w:lastRow="0" w:noHBand="0" w:noVBand="1" w:val="04A0"/>
+      </w:tblPr>
+      <w:tblGrid>
+        <w:gridCol w:w="5040"/>
+        <w:gridCol w:w="5040"/>
+      </w:tblGrid>
+      <w:tr>
+        <w:tc>
+          <w:tcPr>
+            <w:tcW w:type="dxa" w:w="5040"/>
+            <w:vAlign w:val="center"/>
+            <w:shd w:fill="263F38"/>
+          </w:tcPr>
+          <w:p>
+            <w:r/>
+            <w:r>
+              <w:rPr>
+                <w:rFonts w:ascii="Arial" w:hAnsi="Arial"/>
+                <w:b/>
+                <w:color w:val="F4E7B8"/>
+                <w:sz w:val="19"/>
+              </w:rPr>
+              <w:t>Client name</w:t>
+            </w:r>
+          </w:p>
+        </w:tc>
+        <w:tc>
+          <w:tcPr>
+            <w:tcW w:type="dxa" w:w="5040"/>
+            <w:vAlign w:val="center"/>
+          </w:tcPr>
+          <w:p>
+            <w:r/>
+            <w:r>
+              <w:rPr>
+                <w:rFonts w:ascii="Arial" w:hAnsi="Arial"/>
+                <w:b w:val="0"/>
+                <w:sz w:val="19"/>
+              </w:rPr>
+              <w:t>{{CLIENT_NAME}}</w:t>
+            </w:r>
+          </w:p>
+        </w:tc>
+      </w:tr>
+      <w:tr>
+        <w:tc>
+          <w:tcPr>
+            <w:tcW w:type="dxa" w:w="5040"/>
+            <w:vAlign w:val="center"/>
+            <w:shd w:fill="263F38"/>
+          </w:tcPr>
+          <w:p>
+            <w:r/>
+            <w:r>
+              <w:rPr>
+                <w:rFonts w:ascii="Arial" w:hAnsi="Arial"/>
+                <w:b/>
+                <w:color w:val="F4E7B8"/>
+                <w:sz w:val="19"/>
+              </w:rPr>
+              <w:t>Event date</w:t>
+            </w:r>
+          </w:p>
+        </w:tc>
+        <w:tc>
+          <w:tcPr>
+            <w:tcW w:type="dxa" w:w="5040"/>
+            <w:vAlign w:val="center"/>
+          </w:tcPr>
+          <w:p>
+            <w:r/>
+            <w:r>
+              <w:rPr>
+                <w:rFonts w:ascii="Arial" w:hAnsi="Arial"/>
+                <w:b w:val="0"/>
+                <w:sz w:val="19"/>
+              </w:rPr>
+              <w:t>{{EVENT_DATE}}</w:t>
+            </w:r>
+          </w:p>
+        </w:tc>
+      </w:tr>
+      <w:tr>
+        <w:tc>
+          <w:tcPr>
+            <w:tcW w:type="dxa" w:w="5040"/>
+            <w:vAlign w:val="center"/>
+            <w:shd w:fill="263F38"/>
+          </w:tcPr>
+          <w:p>
+            <w:r/>
+            <w:r>
+              <w:rPr>
+                <w:rFonts w:ascii="Arial" w:hAnsi="Arial"/>
+                <w:b/>
+                <w:color w:val="F4E7B8"/>
+                <w:sz w:val="19"/>
+              </w:rPr>
+              <w:t>Venue</w:t>
+            </w:r>
+          </w:p>
+        </w:tc>
+        <w:tc>
+          <w:tcPr>
+            <w:tcW w:type="dxa" w:w="5040"/>
+            <w:vAlign w:val="center"/>
+          </w:tcPr>
+          <w:p>
+            <w:r/>
+            <w:r>
+              <w:rPr>
+                <w:rFonts w:ascii="Arial" w:hAnsi="Arial"/>
+                <w:b w:val="0"/>
+                <w:sz w:val="19"/>
+              </w:rPr>
+              <w:t>{{VENUE_NAME}}</w:t>
+            </w:r>
+          </w:p>
+        </w:tc>
+      </w:tr>
+      <w:tr>
+        <w:tc>
+          <w:tcPr>
+            <w:tcW w:type="dxa" w:w="5040"/>
+            <w:vAlign w:val="center"/>
+            <w:shd w:fill="263F38"/>
+          </w:tcPr>
+          <w:p>
+            <w:r/>
+            <w:r>
+              <w:rPr>
+                <w:rFonts w:ascii="Arial" w:hAnsi="Arial"/>
+                <w:b/>
+                <w:color w:val="F4E7B8"/>
+                <w:sz w:val="19"/>
+              </w:rPr>
+              <w:t>Venue address</w:t>
+            </w:r>
+          </w:p>
+        </w:tc>
+        <w:tc>
+          <w:tcPr>
+            <w:tcW w:type="dxa" w:w="5040"/>
+            <w:vAlign w:val="center"/>
+          </w:tcPr>
+          <w:p>
+            <w:r/>
+            <w:r>
+              <w:rPr>
+                <w:rFonts w:ascii="Arial" w:hAnsi="Arial"/>
+                <w:b w:val="0"/>
+                <w:sz w:val="19"/>
+              </w:rPr>
+              <w:t>{{VENUE_ADDRESS}}</w:t>
+            </w:r>
+          </w:p>
+        </w:tc>
+      </w:tr>
+      <w:tr>
+        <w:tc>
+          <w:tcPr>
+            <w:tcW w:type="dxa" w:w="5040"/>
+            <w:vAlign w:val="center"/>
+            <w:shd w:fill="263F38"/>
+          </w:tcPr>
+          <w:p>
+            <w:r/>
+            <w:r>
+              <w:rPr>
+                <w:rFonts w:ascii="Arial" w:hAnsi="Arial"/>
+                <w:b/>
+                <w:color w:val="F4E7B8"/>
+                <w:sz w:val="19"/>
+              </w:rPr>
+              <w:t>Performance time</w:t>
+            </w:r>
+          </w:p>
+        </w:tc>
+        <w:tc>
+          <w:tcPr>
+            <w:tcW w:type="dxa" w:w="5040"/>
+            <w:vAlign w:val="center"/>
+          </w:tcPr>
+          <w:p>
+            <w:r/>
+            <w:r>
+              <w:rPr>
+                <w:rFonts w:ascii="Arial" w:hAnsi="Arial"/>
+                <w:b w:val="0"/>
+                <w:sz w:val="19"/>
+              </w:rPr>
+              <w:t>{{PERFORMANCE_TIME}}</w:t>
+            </w:r>
+          </w:p>
+        </w:tc>
+      </w:tr>
+      <w:tr>
+        <w:tc>
+          <w:tcPr>
+            <w:tcW w:type="dxa" w:w="5040"/>
+            <w:vAlign w:val="center"/>
+            <w:shd w:fill="263F38"/>
+          </w:tcPr>
+          <w:p>
+            <w:r/>
+            <w:r>
+              <w:rPr>
+                <w:rFonts w:ascii="Arial" w:hAnsi="Arial"/>
+                <w:b/>
+                <w:color w:val="F4E7B8"/>
+                <w:sz w:val="19"/>
+              </w:rPr>
+              <w:t>Ensemble size</w:t>
+            </w:r>
+          </w:p>
+        </w:tc>
+        <w:tc>
+          <w:tcPr>
+            <w:tcW w:type="dxa" w:w="5040"/>
+            <w:vAlign w:val="center"/>
+          </w:tcPr>
+          <w:p>
+            <w:r/>
+            <w:r>
+              <w:rPr>
+                <w:rFonts w:ascii="Arial" w:hAnsi="Arial"/>
+                <w:b w:val="0"/>
+                <w:sz w:val="19"/>
+              </w:rPr>
+              <w:t>{{ENSEMBLE_SIZE}}</w:t>
+            </w:r>
+          </w:p>
+        </w:tc>
+      </w:tr>
+      <w:tr>
+        <w:tc>
+          <w:tcPr>
+            <w:tcW w:type="dxa" w:w="5040"/>
+            <w:vAlign w:val="center"/>
+            <w:shd w:fill="263F38"/>
+          </w:tcPr>
+          <w:p>
+            <w:r/>
+            <w:r>
+              <w:rPr>
+                <w:rFonts w:ascii="Arial" w:hAnsi="Arial"/>
+                <w:b/>
+                <w:color w:val="F4E7B8"/>
+                <w:sz w:val="19"/>
+              </w:rPr>
+              <w:t>Total fee</w:t>
+            </w:r>
+          </w:p>
+        </w:tc>
+        <w:tc>
+          <w:tcPr>
+            <w:tcW w:type="dxa" w:w="5040"/>
+            <w:vAlign w:val="center"/>
+          </w:tcPr>
+          <w:p>
+            <w:r/>
+            <w:r>
+              <w:rPr>
+                <w:rFonts w:ascii="Arial" w:hAnsi="Arial"/>
+                <w:b w:val="0"/>
+                <w:sz w:val="19"/>
+              </w:rPr>
+              <w:t>{{TOTAL_FEE}}</w:t>
+            </w:r>
+          </w:p>
+        </w:tc>
+      </w:tr>
+      <w:tr>
+        <w:tc>
+          <w:tcPr>
+            <w:tcW w:type="dxa" w:w="5040"/>
+            <w:vAlign w:val="center"/>
+            <w:shd w:fill="263F38"/>
+          </w:tcPr>
+          <w:p>
+            <w:r/>
+            <w:r>
+              <w:rPr>
+                <w:rFonts w:ascii="Arial" w:hAnsi="Arial"/>
+                <w:b/>
+                <w:color w:val="F4E7B8"/>
+                <w:sz w:val="19"/>
+              </w:rPr>
+              <w:t>Deposit amount</w:t>
+            </w:r>
+          </w:p>
+        </w:tc>
+        <w:tc>
+          <w:tcPr>
+            <w:tcW w:type="dxa" w:w="5040"/>
+            <w:vAlign w:val="center"/>
+          </w:tcPr>
+          <w:p>
+            <w:r/>
+            <w:r>
+              <w:rPr>
+                <w:rFonts w:ascii="Arial" w:hAnsi="Arial"/>
+                <w:b w:val="0"/>
+                <w:sz w:val="19"/>
+              </w:rPr>
+              <w:t>{{DEPOSIT_AMOUNT}}</w:t>
+            </w:r>
+          </w:p>
+        </w:tc>
+      </w:tr>
+      <w:tr>
+        <w:tc>
+          <w:tcPr>
+            <w:tcW w:type="dxa" w:w="5040"/>
+            <w:vAlign w:val="center"/>
+            <w:shd w:fill="263F38"/>
+          </w:tcPr>
+          <w:p>
+            <w:r/>
+            <w:r>
+              <w:rPr>
+                <w:rFonts w:ascii="Arial" w:hAnsi="Arial"/>
+                <w:b/>
+                <w:color w:val="F4E7B8"/>
+                <w:sz w:val="19"/>
+              </w:rPr>
+              <w:t>Remaining balance</w:t>
+            </w:r>
+          </w:p>
+        </w:tc>
+        <w:tc>
+          <w:tcPr>
+            <w:tcW w:type="dxa" w:w="5040"/>
+            <w:vAlign w:val="center"/>
+          </w:tcPr>
+          <w:p>
+            <w:r/>
+            <w:r>
+              <w:rPr>
+                <w:rFonts w:ascii="Arial" w:hAnsi="Arial"/>
+                <w:b w:val="0"/>
+                <w:sz w:val="19"/>
+              </w:rPr>
+              <w:t>{{REMAINING_BALANCE}}</w:t>
+            </w:r>
+          </w:p>
+        </w:tc>
+      </w:tr>
+      <w:tr>
+        <w:tc>
+          <w:tcPr>
+            <w:tcW w:type="dxa" w:w="5040"/>
+            <w:vAlign w:val="center"/>
+            <w:shd w:fill="263F38"/>
+          </w:tcPr>
+          <w:p>
+            <w:r/>
+            <w:r>
+              <w:rPr>
+                <w:rFonts w:ascii="Arial" w:hAnsi="Arial"/>
+                <w:b/>
+                <w:color w:val="F4E7B8"/>
+                <w:sz w:val="19"/>
+              </w:rPr>
+              <w:t>Special notes</w:t>
+            </w:r>
+          </w:p>
+        </w:tc>
+        <w:tc>
+          <w:tcPr>
+            <w:tcW w:type="dxa" w:w="5040"/>
+            <w:vAlign w:val="center"/>
+          </w:tcPr>
+          <w:p>
+            <w:r/>
+            <w:r>
+              <w:rPr>
+                <w:rFonts w:ascii="Arial" w:hAnsi="Arial"/>
+                <w:b w:val="0"/>
+                <w:sz w:val="19"/>
+              </w:rPr>
+              <w:t>{{SPECIAL_NOTES}}</w:t>
+            </w:r>
+          </w:p>
+        </w:tc>
+      </w:tr>
+    </w:tbl>
+    <w:p/>
+    <w:p>
+      <w:r>
+        <w:br w:type="page"/>
+      </w:r>
+    </w:p>
+    <w:p>
+      <w:pPr>
+        <w:pStyle w:val="Heading1"/>
+      </w:pPr>
+      <w:r>
+        <w:rPr>
+          <w:rFonts w:ascii="Georgia" w:hAnsi="Georgia"/>
+          <w:color w:val="263F38"/>
+        </w:rPr>
+        <w:t>Performance Agreement</w:t>
+      </w:r>
+    </w:p>
+    <w:p>
+      <w:r>
+        <w:t>This agreement confirms the musical services, payment terms, planning notes, and performance logistics for {{CLIENT_NAME}}.</w:t>
+      </w:r>
+    </w:p>
+    <w:p>
+      <w:pPr>
+        <w:pStyle w:val="Heading2"/>
+      </w:pPr>
+      <w:r>
+        <w:rPr>
+          <w:rFonts w:ascii="Georgia" w:hAnsi="Georgia"/>
+          <w:color w:val="263F38"/>
+        </w:rPr>
+        <w:t>Client and event details</w:t>
+      </w:r>
+    </w:p>
+    <w:tbl>
+      <w:tblPr>
+        <w:tblStyle w:val="TableGrid"/>
+        <w:tblW w:type="auto" w:w="0"/>
+        <w:tblLook w:firstColumn="1" w:firstRow="1" w:lastColumn="0" w:lastRow="0" w:noHBand="0" w:noVBand="1" w:val="04A0"/>
+      </w:tblPr>
+      <w:tblGrid>
+        <w:gridCol w:w="5040"/>
+        <w:gridCol w:w="5040"/>
+      </w:tblGrid>
+      <w:tr>
+        <w:tc>
+          <w:tcPr>
+            <w:tcW w:type="dxa" w:w="5040"/>
+            <w:vAlign w:val="center"/>
+            <w:shd w:fill="263F38"/>
+          </w:tcPr>
+          <w:p>
+            <w:r/>
+            <w:r>
+              <w:rPr>
+                <w:rFonts w:ascii="Arial" w:hAnsi="Arial"/>
+                <w:b/>
+                <w:color w:val="F4E7B8"/>
+                <w:sz w:val="19"/>
+              </w:rPr>
+              <w:t>Client / planner</w:t>
+            </w:r>
+          </w:p>
+        </w:tc>
+        <w:tc>
+          <w:tcPr>
+            <w:tcW w:type="dxa" w:w="5040"/>
+            <w:vAlign w:val="center"/>
+          </w:tcPr>
+          <w:p>
+            <w:r/>
+            <w:r>
+              <w:rPr>
+                <w:rFonts w:ascii="Arial" w:hAnsi="Arial"/>
+                <w:b w:val="0"/>
+                <w:sz w:val="19"/>
+              </w:rPr>
+              <w:t>{{CLIENT_NAME}} / {{PLANNER_NAME}}</w:t>
+            </w:r>
+          </w:p>
+        </w:tc>
+      </w:tr>
+      <w:tr>
+        <w:tc>
+          <w:tcPr>
+            <w:tcW w:type="dxa" w:w="5040"/>
+            <w:vAlign w:val="center"/>
+            <w:shd w:fill="263F38"/>
+          </w:tcPr>
+          <w:p>
+            <w:r/>
+            <w:r>
+              <w:rPr>
+                <w:rFonts w:ascii="Arial" w:hAnsi="Arial"/>
+                <w:b/>
+                <w:color w:val="F4E7B8"/>
+                <w:sz w:val="19"/>
+              </w:rPr>
+              <w:t>Email / phone</w:t>
+            </w:r>
+          </w:p>
+        </w:tc>
+        <w:tc>
+          <w:tcPr>
+            <w:tcW w:type="dxa" w:w="5040"/>
+            <w:vAlign w:val="center"/>
+          </w:tcPr>
+          <w:p>
+            <w:r/>
+            <w:r>
+              <w:rPr>
+                <w:rFonts w:ascii="Arial" w:hAnsi="Arial"/>
+                <w:b w:val="0"/>
+                <w:sz w:val="19"/>
+              </w:rPr>
+              <w:t>{{CLIENT_EMAIL}} / {{CLIENT_PHONE}}</w:t>
+            </w:r>
+          </w:p>
+        </w:tc>
+      </w:tr>
+      <w:tr>
+        <w:tc>
+          <w:tcPr>
+            <w:tcW w:type="dxa" w:w="5040"/>
+            <w:vAlign w:val="center"/>
+            <w:shd w:fill="263F38"/>
+          </w:tcPr>
+          <w:p>
+            <w:r/>
+            <w:r>
+              <w:rPr>
+                <w:rFonts w:ascii="Arial" w:hAnsi="Arial"/>
+                <w:b/>
+                <w:color w:val="F4E7B8"/>
+                <w:sz w:val="19"/>
+              </w:rPr>
+              <w:t>Event date</w:t>
+            </w:r>
+          </w:p>
+        </w:tc>
+        <w:tc>
+          <w:tcPr>
+            <w:tcW w:type="dxa" w:w="5040"/>
+            <w:vAlign w:val="center"/>
+          </w:tcPr>
+          <w:p>
+            <w:r/>
+            <w:r>
+              <w:rPr>
+                <w:rFonts w:ascii="Arial" w:hAnsi="Arial"/>
+                <w:b w:val="0"/>
+                <w:sz w:val="19"/>
+              </w:rPr>
+              <w:t>{{EVENT_DATE}}</w:t>
+            </w:r>
+          </w:p>
+        </w:tc>
+      </w:tr>
+      <w:tr>
+        <w:tc>
+          <w:tcPr>
+            <w:tcW w:type="dxa" w:w="5040"/>
+            <w:vAlign w:val="center"/>
+            <w:shd w:fill="263F38"/>
+          </w:tcPr>
+          <w:p>
+            <w:r/>
+            <w:r>
+              <w:rPr>
+                <w:rFonts w:ascii="Arial" w:hAnsi="Arial"/>
+                <w:b/>
+                <w:color w:val="F4E7B8"/>
+                <w:sz w:val="19"/>
+              </w:rPr>
+              <w:t>Venue</w:t>
+            </w:r>
+          </w:p>
+        </w:tc>
+        <w:tc>
+          <w:tcPr>
+            <w:tcW w:type="dxa" w:w="5040"/>
+            <w:vAlign w:val="center"/>
+          </w:tcPr>
+          <w:p>
+            <w:r/>
+            <w:r>
+              <w:rPr>
+                <w:rFonts w:ascii="Arial" w:hAnsi="Arial"/>
+                <w:b w:val="0"/>
+                <w:sz w:val="19"/>
+              </w:rPr>
+              <w:t>{{VENUE_NAME}}</w:t>
+            </w:r>
+          </w:p>
+        </w:tc>
+      </w:tr>
+      <w:tr>
+        <w:tc>
+          <w:tcPr>
+            <w:tcW w:type="dxa" w:w="5040"/>
+            <w:vAlign w:val="center"/>
+            <w:shd w:fill="263F38"/>
+          </w:tcPr>
+          <w:p>
+            <w:r/>
+            <w:r>
+              <w:rPr>
+                <w:rFonts w:ascii="Arial" w:hAnsi="Arial"/>
+                <w:b/>
+                <w:color w:val="F4E7B8"/>
+                <w:sz w:val="19"/>
+              </w:rPr>
+              <w:t>Venue address</w:t>
+            </w:r>
+          </w:p>
+        </w:tc>
+        <w:tc>
+          <w:tcPr>
+            <w:tcW w:type="dxa" w:w="5040"/>
+            <w:vAlign w:val="center"/>
+          </w:tcPr>
+          <w:p>
+            <w:r/>
+            <w:r>
+              <w:rPr>
+                <w:rFonts w:ascii="Arial" w:hAnsi="Arial"/>
+                <w:b w:val="0"/>
+                <w:sz w:val="19"/>
+              </w:rPr>
+              <w:t>{{VENUE_ADDRESS}}</w:t>
+            </w:r>
+          </w:p>
+        </w:tc>
+      </w:tr>
+      <w:tr>
+        <w:tc>
+          <w:tcPr>
+            <w:tcW w:type="dxa" w:w="5040"/>
+            <w:vAlign w:val="center"/>
+            <w:shd w:fill="263F38"/>
+          </w:tcPr>
+          <w:p>
+            <w:r/>
+            <w:r>
+              <w:rPr>
+                <w:rFonts w:ascii="Arial" w:hAnsi="Arial"/>
+                <w:b/>
+                <w:color w:val="F4E7B8"/>
+                <w:sz w:val="19"/>
+              </w:rPr>
+              <w:t>Performance window</w:t>
+            </w:r>
+          </w:p>
+        </w:tc>
+        <w:tc>
+          <w:tcPr>
+            <w:tcW w:type="dxa" w:w="5040"/>
+            <w:vAlign w:val="center"/>
+          </w:tcPr>
+          <w:p>
+            <w:r/>
+            <w:r>
+              <w:rPr>
+                <w:rFonts w:ascii="Arial" w:hAnsi="Arial"/>
+                <w:b w:val="0"/>
+                <w:sz w:val="19"/>
+              </w:rPr>
+              <w:t>{{PERFORMANCE_TIME}}</w:t>
+            </w:r>
+          </w:p>
+        </w:tc>
+      </w:tr>
+      <w:tr>
+        <w:tc>
+          <w:tcPr>
+            <w:tcW w:type="dxa" w:w="5040"/>
+            <w:vAlign w:val="center"/>
+            <w:shd w:fill="263F38"/>
+          </w:tcPr>
+          <w:p>
+            <w:r/>
+            <w:r>
+              <w:rPr>
+                <w:rFonts w:ascii="Arial" w:hAnsi="Arial"/>
+                <w:b/>
+                <w:color w:val="F4E7B8"/>
+                <w:sz w:val="19"/>
+              </w:rPr>
+              <w:t>Ensemble</w:t>
+            </w:r>
+          </w:p>
+        </w:tc>
+        <w:tc>
+          <w:tcPr>
+            <w:tcW w:type="dxa" w:w="5040"/>
+            <w:vAlign w:val="center"/>
+          </w:tcPr>
+          <w:p>
+            <w:r/>
+            <w:r>
+              <w:rPr>
+                <w:rFonts w:ascii="Arial" w:hAnsi="Arial"/>
+                <w:b w:val="0"/>
+                <w:sz w:val="19"/>
+              </w:rPr>
+              <w:t>{{ENSEMBLE_SIZE}}</w:t>
+            </w:r>
+          </w:p>
+        </w:tc>
+      </w:tr>
+      <w:tr>
+        <w:tc>
+          <w:tcPr>
+            <w:tcW w:type="dxa" w:w="5040"/>
+            <w:vAlign w:val="center"/>
+            <w:shd w:fill="263F38"/>
+          </w:tcPr>
+          <w:p>
+            <w:r/>
+            <w:r>
+              <w:rPr>
+                <w:rFonts w:ascii="Arial" w:hAnsi="Arial"/>
+                <w:b/>
+                <w:color w:val="F4E7B8"/>
+                <w:sz w:val="19"/>
+              </w:rPr>
+              <w:t>Sound provided by</w:t>
+            </w:r>
+          </w:p>
+        </w:tc>
+        <w:tc>
+          <w:tcPr>
+            <w:tcW w:type="dxa" w:w="5040"/>
+            <w:vAlign w:val="center"/>
+          </w:tcPr>
+          <w:p>
+            <w:r/>
+            <w:r>
+              <w:rPr>
+                <w:rFonts w:ascii="Arial" w:hAnsi="Arial"/>
+                <w:b w:val="0"/>
+                <w:sz w:val="19"/>
+              </w:rPr>
+              <w:t>{{SOUND_PROVIDER}}</w:t>
+            </w:r>
+          </w:p>
+        </w:tc>
+      </w:tr>
+    </w:tbl>
+    <w:p/>
+    <w:p>
+      <w:pPr>
+        <w:pStyle w:val="Heading2"/>
+      </w:pPr>
+      <w:r>
+        <w:rPr>
+          <w:rFonts w:ascii="Georgia" w:hAnsi="Georgia"/>
+          <w:color w:val="263F38"/>
+        </w:rPr>
+        <w:t>Payment and deposit terms</w:t>
+      </w:r>
+    </w:p>
+    <w:tbl>
+      <w:tblPr>
+        <w:tblStyle w:val="TableGrid"/>
+        <w:tblW w:type="auto" w:w="0"/>
+        <w:tblLook w:firstColumn="1" w:firstRow="1" w:lastColumn="0" w:lastRow="0" w:noHBand="0" w:noVBand="1" w:val="04A0"/>
+      </w:tblPr>
+      <w:tblGrid>
+        <w:gridCol w:w="5040"/>
+        <w:gridCol w:w="5040"/>
+      </w:tblGrid>
+      <w:tr>
+        <w:tc>
+          <w:tcPr>
+            <w:tcW w:type="dxa" w:w="5040"/>
+            <w:vAlign w:val="center"/>
+            <w:shd w:fill="263F38"/>
+          </w:tcPr>
+          <w:p>
+            <w:r/>
+            <w:r>
+              <w:rPr>
+                <w:rFonts w:ascii="Arial" w:hAnsi="Arial"/>
+                <w:b/>
+                <w:color w:val="F4E7B8"/>
+                <w:sz w:val="19"/>
+              </w:rPr>
+              <w:t>Total performance fee</w:t>
+            </w:r>
+          </w:p>
+        </w:tc>
+        <w:tc>
+          <w:tcPr>
+            <w:tcW w:type="dxa" w:w="5040"/>
+            <w:vAlign w:val="center"/>
+          </w:tcPr>
+          <w:p>
+            <w:r/>
+            <w:r>
+              <w:rPr>
+                <w:rFonts w:ascii="Arial" w:hAnsi="Arial"/>
+                <w:b w:val="0"/>
+                <w:sz w:val="19"/>
+              </w:rPr>
+              <w:t>{{TOTAL_FEE}}</w:t>
+            </w:r>
+          </w:p>
+        </w:tc>
+      </w:tr>
+      <w:tr>
+        <w:tc>
+          <w:tcPr>
+            <w:tcW w:type="dxa" w:w="5040"/>
+            <w:vAlign w:val="center"/>
+            <w:shd w:fill="263F38"/>
+          </w:tcPr>
+          <w:p>
+            <w:r/>
+            <w:r>
+              <w:rPr>
+                <w:rFonts w:ascii="Arial" w:hAnsi="Arial"/>
+                <w:b/>
+                <w:color w:val="F4E7B8"/>
+                <w:sz w:val="19"/>
+              </w:rPr>
+              <w:t>Deposit due to reserve date</w:t>
+            </w:r>
+          </w:p>
+        </w:tc>
+        <w:tc>
+          <w:tcPr>
+            <w:tcW w:type="dxa" w:w="5040"/>
+            <w:vAlign w:val="center"/>
+          </w:tcPr>
+          <w:p>
+            <w:r/>
+            <w:r>
+              <w:rPr>
+                <w:rFonts w:ascii="Arial" w:hAnsi="Arial"/>
+                <w:b w:val="0"/>
+                <w:sz w:val="19"/>
+              </w:rPr>
+              <w:t>{{DEPOSIT_AMOUNT}}</w:t>
+            </w:r>
+          </w:p>
+        </w:tc>
+      </w:tr>
+      <w:tr>
+        <w:tc>
+          <w:tcPr>
+            <w:tcW w:type="dxa" w:w="5040"/>
+            <w:vAlign w:val="center"/>
+            <w:shd w:fill="263F38"/>
+          </w:tcPr>
+          <w:p>
+            <w:r/>
+            <w:r>
+              <w:rPr>
+                <w:rFonts w:ascii="Arial" w:hAnsi="Arial"/>
+                <w:b/>
+                <w:color w:val="F4E7B8"/>
+                <w:sz w:val="19"/>
+              </w:rPr>
+              <w:t>Remaining balance</w:t>
+            </w:r>
+          </w:p>
+        </w:tc>
+        <w:tc>
+          <w:tcPr>
+            <w:tcW w:type="dxa" w:w="5040"/>
+            <w:vAlign w:val="center"/>
+          </w:tcPr>
+          <w:p>
+            <w:r/>
+            <w:r>
+              <w:rPr>
+                <w:rFonts w:ascii="Arial" w:hAnsi="Arial"/>
+                <w:b w:val="0"/>
+                <w:sz w:val="19"/>
+              </w:rPr>
+              <w:t>{{REMAINING_BALANCE}}</w:t>
+            </w:r>
+          </w:p>
+        </w:tc>
+      </w:tr>
+      <w:tr>
+        <w:tc>
+          <w:tcPr>
+            <w:tcW w:type="dxa" w:w="5040"/>
+            <w:vAlign w:val="center"/>
+            <w:shd w:fill="263F38"/>
+          </w:tcPr>
+          <w:p>
+            <w:r/>
+            <w:r>
+              <w:rPr>
+                <w:rFonts w:ascii="Arial" w:hAnsi="Arial"/>
+                <w:b/>
+                <w:color w:val="F4E7B8"/>
+                <w:sz w:val="19"/>
+              </w:rPr>
+              <w:t>Balance due date</w:t>
+            </w:r>
+          </w:p>
+        </w:tc>
+        <w:tc>
+          <w:tcPr>
+            <w:tcW w:type="dxa" w:w="5040"/>
+            <w:vAlign w:val="center"/>
+          </w:tcPr>
+          <w:p>
+            <w:r/>
+            <w:r>
+              <w:rPr>
+                <w:rFonts w:ascii="Arial" w:hAnsi="Arial"/>
+                <w:b w:val="0"/>
+                <w:sz w:val="19"/>
+              </w:rPr>
+              <w:t>{{BALANCE_DUE_DATE}}</w:t>
+            </w:r>
+          </w:p>
+        </w:tc>
+      </w:tr>
+      <w:tr>
+        <w:tc>
+          <w:tcPr>
+            <w:tcW w:type="dxa" w:w="5040"/>
+            <w:vAlign w:val="center"/>
+            <w:shd w:fill="263F38"/>
+          </w:tcPr>
+          <w:p>
+            <w:r/>
+            <w:r>
+              <w:rPr>
+                <w:rFonts w:ascii="Arial" w:hAnsi="Arial"/>
+                <w:b/>
+                <w:color w:val="F4E7B8"/>
+                <w:sz w:val="19"/>
+              </w:rPr>
+              <w:t>Payment method</w:t>
+            </w:r>
+          </w:p>
+        </w:tc>
+        <w:tc>
+          <w:tcPr>
+            <w:tcW w:type="dxa" w:w="5040"/>
+            <w:vAlign w:val="center"/>
+          </w:tcPr>
+          <w:p>
+            <w:r/>
+            <w:r>
+              <w:rPr>
+                <w:rFonts w:ascii="Arial" w:hAnsi="Arial"/>
+                <w:b w:val="0"/>
+                <w:sz w:val="19"/>
+              </w:rPr>
+              <w:t>{{PAYMENT_METHOD}}</w:t>
+            </w:r>
+          </w:p>
+        </w:tc>
+      </w:tr>
+    </w:tbl>
+    <w:p/>
+    <w:p>
+      <w:pPr>
+        <w:pStyle w:val="Heading2"/>
+      </w:pPr>
+      <w:r>
+        <w:rPr>
+          <w:rFonts w:ascii="Georgia" w:hAnsi="Georgia"/>
+          <w:color w:val="263F38"/>
+        </w:rPr>
+        <w:t>Terms and expectations</w:t>
+      </w:r>
+    </w:p>
+    <w:p>
+      <w:pPr>
+        <w:pStyle w:val="ListBullet"/>
+        <w:spacing w:after="80"/>
+      </w:pPr>
+      <w:r>
+        <w:t>Date is reserved after agreement signature and deposit receipt.</w:t>
+      </w:r>
+    </w:p>
+    <w:p>
+      <w:pPr>
+        <w:pStyle w:val="ListBullet"/>
+        <w:spacing w:after="80"/>
+      </w:pPr>
+      <w:r>
+        <w:t>Client provides safe performance area, reasonable load-in access, and any required parking or vendor credentials.</w:t>
+      </w:r>
+    </w:p>
+    <w:p>
+      <w:pPr>
+        <w:pStyle w:val="ListBullet"/>
+        <w:spacing w:after="80"/>
+      </w:pPr>
+      <w:r>
+        <w:t>Outdoor performances require weather protection, shade when appropriate, and a stable performance surface.</w:t>
+      </w:r>
+    </w:p>
+    <w:p>
+      <w:pPr>
+        <w:pStyle w:val="ListBullet"/>
+        <w:spacing w:after="80"/>
+      </w:pPr>
+      <w:r>
+        <w:t>Custom arrangements and special song requests are quoted separately unless included in writing.</w:t>
+      </w:r>
+    </w:p>
+    <w:p>
+      <w:pPr>
+        <w:pStyle w:val="ListBullet"/>
+        <w:spacing w:after="80"/>
+      </w:pPr>
+      <w:r>
+        <w:t>Cancellation, postponement, and severe-weather changes should be handled in writing as early as possible.</w:t>
+      </w:r>
+    </w:p>
+    <w:p>
+      <w:pPr>
+        <w:pStyle w:val="ListBullet"/>
+        <w:spacing w:after="80"/>
+      </w:pPr>
+      <w:r>
+        <w:t>Final schedule, announcements, and music notes should be confirmed two weeks before the event when possible.</w:t>
+      </w:r>
+    </w:p>
+    <w:p>
+      <w:pPr>
+        <w:pStyle w:val="Heading2"/>
+      </w:pPr>
+      <w:r>
+        <w:rPr>
+          <w:rFonts w:ascii="Georgia" w:hAnsi="Georgia"/>
+          <w:color w:val="263F38"/>
+        </w:rPr>
+        <w:t>Signatures</w:t>
+      </w:r>
+    </w:p>
+    <w:tbl>
+      <w:tblPr>
+        <w:tblStyle w:val="TableGrid"/>
+        <w:tblW w:type="auto" w:w="0"/>
+        <w:tblLook w:firstColumn="1" w:firstRow="1" w:lastColumn="0" w:lastRow="0" w:noHBand="0" w:noVBand="1" w:val="04A0"/>
+      </w:tblPr>
+      <w:tblGrid>
+        <w:gridCol w:w="5040"/>
+        <w:gridCol w:w="5040"/>
+      </w:tblGrid>
+      <w:tr>
+        <w:tc>
+          <w:tcPr>
+            <w:tcW w:type="dxa" w:w="5040"/>
+            <w:vAlign w:val="center"/>
+            <w:shd w:fill="263F38"/>
+          </w:tcPr>
+          <w:p>
+            <w:r/>
+            <w:r>
+              <w:rPr>
+                <w:rFonts w:ascii="Arial" w:hAnsi="Arial"/>
+                <w:b/>
+                <w:color w:val="F4E7B8"/>
+                <w:sz w:val="19"/>
+              </w:rPr>
+              <w:t>Client signature</w:t>
+            </w:r>
+          </w:p>
+        </w:tc>
+        <w:tc>
+          <w:tcPr>
+            <w:tcW w:type="dxa" w:w="5040"/>
+            <w:vAlign w:val="center"/>
+          </w:tcPr>
+          <w:p>
+            <w:r/>
+            <w:r>
+              <w:rPr>
+                <w:rFonts w:ascii="Arial" w:hAnsi="Arial"/>
+                <w:b w:val="0"/>
+                <w:sz w:val="19"/>
+              </w:rPr>
+              <w:t>____________________________________  Date: __________</w:t>
+            </w:r>
+          </w:p>
+        </w:tc>
+      </w:tr>
+      <w:tr>
+        <w:tc>
+          <w:tcPr>
+            <w:tcW w:type="dxa" w:w="5040"/>
+            <w:vAlign w:val="center"/>
+            <w:shd w:fill="263F38"/>
+          </w:tcPr>
+          <w:p>
+            <w:r/>
+            <w:r>
+              <w:rPr>
+                <w:rFonts w:ascii="Arial" w:hAnsi="Arial"/>
+                <w:b/>
+                <w:color w:val="F4E7B8"/>
+                <w:sz w:val="19"/>
+              </w:rPr>
+              <w:t>Artist / representative</w:t>
+            </w:r>
+          </w:p>
+        </w:tc>
+        <w:tc>
+          <w:tcPr>
+            <w:tcW w:type="dxa" w:w="5040"/>
+            <w:vAlign w:val="center"/>
+          </w:tcPr>
+          <w:p>
+            <w:r/>
+            <w:r>
+              <w:rPr>
+                <w:rFonts w:ascii="Arial" w:hAnsi="Arial"/>
+                <w:b w:val="0"/>
+                <w:sz w:val="19"/>
+              </w:rPr>
+              <w:t>____________________________________  Date: __________</w:t>
+            </w:r>
+          </w:p>
+        </w:tc>
+      </w:tr>
+    </w:tbl>
+    <w:p/>
+    <w:p>
+      <w:r>
+        <w:br w:type="page"/>
+      </w:r>
+    </w:p>
+    <w:p>
+      <w:pPr>
+        <w:pStyle w:val="Heading1"/>
+      </w:pPr>
+      <w:r>
+        <w:rPr>
+          <w:rFonts w:ascii="Georgia" w:hAnsi="Georgia"/>
+          <w:color w:val="263F38"/>
+        </w:rPr>
+        <w:t>Wedding Music Planning Questionnaire</w:t>
+      </w:r>
+    </w:p>
+    <w:p>
+      <w:pPr>
+        <w:pStyle w:val="Heading2"/>
+      </w:pPr>
+      <w:r>
+        <w:rPr>
+          <w:rFonts w:ascii="Georgia" w:hAnsi="Georgia"/>
+          <w:color w:val="263F38"/>
+        </w:rPr>
+        <w:t>Ceremony music</w:t>
+      </w:r>
+    </w:p>
+    <w:p>
+      <w:r>
+        <w:t>Processional song(s): ______________________________________________</w:t>
+      </w:r>
+    </w:p>
+    <w:p>
+      <w:r>
+        <w:t>Bride / main entrance song: ________________________________________</w:t>
+      </w:r>
+    </w:p>
+    <w:p>
+      <w:r>
+        <w:t>Recessional song: _________________________________________________</w:t>
+      </w:r>
+    </w:p>
+    <w:p>
+      <w:r>
+        <w:t>Special moments or cultural traditions: ____________________________</w:t>
+      </w:r>
+    </w:p>
+    <w:p/>
+    <w:p>
+      <w:pPr>
+        <w:pStyle w:val="Heading2"/>
+      </w:pPr>
+      <w:r>
+        <w:rPr>
+          <w:rFonts w:ascii="Georgia" w:hAnsi="Georgia"/>
+          <w:color w:val="263F38"/>
+        </w:rPr>
+        <w:t>Cocktail hour / reception</w:t>
+      </w:r>
+    </w:p>
+    <w:p>
+      <w:r>
+        <w:t>Preferred feel: relaxed / upbeat / elegant / dance-forward</w:t>
+      </w:r>
+    </w:p>
+    <w:p>
+      <w:r>
+        <w:t>Must-play songs: _________________________________________________</w:t>
+      </w:r>
+    </w:p>
+    <w:p>
+      <w:r>
+        <w:t>Do-not-play notes: _______________________________________________</w:t>
+      </w:r>
+    </w:p>
+    <w:p>
+      <w:r>
+        <w:t>Announcements or cues: ___________________________________________</w:t>
+      </w:r>
+    </w:p>
+    <w:p/>
+    <w:p>
+      <w:pPr>
+        <w:pStyle w:val="Heading2"/>
+      </w:pPr>
+      <w:r>
+        <w:rPr>
+          <w:rFonts w:ascii="Georgia" w:hAnsi="Georgia"/>
+          <w:color w:val="263F38"/>
+        </w:rPr>
+        <w:t>Venue logistics</w:t>
+      </w:r>
+    </w:p>
+    <w:p>
+      <w:r>
+        <w:t>Planner or day-of contact: ________________________________________</w:t>
+      </w:r>
+    </w:p>
+    <w:p>
+      <w:r>
+        <w:t>Load-in time and entrance: ________________________________________</w:t>
+      </w:r>
+    </w:p>
+    <w:p>
+      <w:r>
+        <w:t>Power location / stage size: ______________________________________</w:t>
+      </w:r>
+    </w:p>
+    <w:p>
+      <w:r>
+        <w:t>Parking, green room, meals, or vendor notes: _______________________</w:t>
+      </w:r>
+    </w:p>
+    <w:p/>
+    <w:p>
+      <w:pPr>
+        <w:pStyle w:val="Heading1"/>
+      </w:pPr>
+      <w:r>
+        <w:rPr>
+          <w:rFonts w:ascii="Georgia" w:hAnsi="Georgia"/>
+          <w:color w:val="263F38"/>
+        </w:rPr>
+        <w:t>Sample Set Lists</w:t>
+      </w:r>
+    </w:p>
+    <w:p>
+      <w:pPr>
+        <w:pStyle w:val="Heading2"/>
+      </w:pPr>
+      <w:r>
+        <w:rPr>
+          <w:rFonts w:ascii="Georgia" w:hAnsi="Georgia"/>
+          <w:color w:val="263F38"/>
+        </w:rPr>
+        <w:t>East Coast Swing / Cocktail Set</w:t>
+      </w:r>
+    </w:p>
+    <w:p>
+      <w:pPr>
+        <w:pStyle w:val="ListBullet"/>
+        <w:spacing w:after="80"/>
+      </w:pPr>
+      <w:r>
+        <w:t>Ain't Misbehavin'</w:t>
+      </w:r>
+    </w:p>
+    <w:p>
+      <w:pPr>
+        <w:pStyle w:val="ListBullet"/>
+        <w:spacing w:after="80"/>
+      </w:pPr>
+      <w:r>
+        <w:t>All of Me</w:t>
+      </w:r>
+    </w:p>
+    <w:p>
+      <w:pPr>
+        <w:pStyle w:val="ListBullet"/>
+        <w:spacing w:after="80"/>
+      </w:pPr>
+      <w:r>
+        <w:t>Blue Bossa</w:t>
+      </w:r>
+    </w:p>
+    <w:p>
+      <w:pPr>
+        <w:pStyle w:val="ListBullet"/>
+        <w:spacing w:after="80"/>
+      </w:pPr>
+      <w:r>
+        <w:t>Fly Me to the Moon</w:t>
+      </w:r>
+    </w:p>
+    <w:p>
+      <w:pPr>
+        <w:pStyle w:val="ListBullet"/>
+        <w:spacing w:after="80"/>
+      </w:pPr>
+      <w:r>
+        <w:t>I Got Rhythm</w:t>
+      </w:r>
+    </w:p>
+    <w:p>
+      <w:pPr>
+        <w:pStyle w:val="ListBullet"/>
+        <w:spacing w:after="80"/>
+      </w:pPr>
+      <w:r>
+        <w:t>It Don't Mean a Thing</w:t>
+      </w:r>
+    </w:p>
+    <w:p>
+      <w:pPr>
+        <w:pStyle w:val="ListBullet"/>
+        <w:spacing w:after="80"/>
+      </w:pPr>
+      <w:r>
+        <w:t>On the Sunny Side of the Street</w:t>
+      </w:r>
+    </w:p>
+    <w:p>
+      <w:pPr>
+        <w:pStyle w:val="Heading2"/>
+      </w:pPr>
+      <w:r>
+        <w:rPr>
+          <w:rFonts w:ascii="Georgia" w:hAnsi="Georgia"/>
+          <w:color w:val="263F38"/>
+        </w:rPr>
+        <w:t>Funk Brass Band / Party Set</w:t>
+      </w:r>
+    </w:p>
+    <w:p>
+      <w:pPr>
+        <w:pStyle w:val="ListBullet"/>
+        <w:spacing w:after="80"/>
+      </w:pPr>
+      <w:r>
+        <w:t>Cissy Strut</w:t>
+      </w:r>
+    </w:p>
+    <w:p>
+      <w:pPr>
+        <w:pStyle w:val="ListBullet"/>
+        <w:spacing w:after="80"/>
+      </w:pPr>
+      <w:r>
+        <w:t>Chameleon</w:t>
+      </w:r>
+    </w:p>
+    <w:p>
+      <w:pPr>
+        <w:pStyle w:val="ListBullet"/>
+        <w:spacing w:after="80"/>
+      </w:pPr>
+      <w:r>
+        <w:t>Feel Like Funkin' It Up</w:t>
+      </w:r>
+    </w:p>
+    <w:p>
+      <w:pPr>
+        <w:pStyle w:val="ListBullet"/>
+        <w:spacing w:after="80"/>
+      </w:pPr>
+      <w:r>
+        <w:t>I Wish</w:t>
+      </w:r>
+    </w:p>
+    <w:p>
+      <w:pPr>
+        <w:pStyle w:val="ListBullet"/>
+        <w:spacing w:after="80"/>
+      </w:pPr>
+      <w:r>
+        <w:t>Pass the Peas</w:t>
+      </w:r>
+    </w:p>
+    <w:p>
+      <w:pPr>
+        <w:pStyle w:val="ListBullet"/>
+        <w:spacing w:after="80"/>
+      </w:pPr>
+      <w:r>
+        <w:t>September</w:t>
+      </w:r>
+    </w:p>
+    <w:p>
+      <w:pPr>
+        <w:pStyle w:val="ListBullet"/>
+        <w:spacing w:after="80"/>
+      </w:pPr>
+      <w:r>
+        <w:t>Street Parade</w:t>
+      </w:r>
+    </w:p>
+    <w:p>
+      <w:pPr>
+        <w:pStyle w:val="Heading1"/>
+      </w:pPr>
+      <w:r>
+        <w:rPr>
+          <w:rFonts w:ascii="Georgia" w:hAnsi="Georgia"/>
+          <w:color w:val="263F38"/>
+        </w:rPr>
+        <w:t>Song Request Guide</w:t>
+      </w:r>
+    </w:p>
+    <w:p>
+      <w:pPr>
+        <w:pStyle w:val="ListBullet"/>
+        <w:spacing w:after="80"/>
+      </w:pPr>
+      <w:r>
+        <w:t>Send must-play songs early with artist names or reference links.</w:t>
+      </w:r>
+    </w:p>
+    <w:p>
+      <w:pPr>
+        <w:pStyle w:val="ListBullet"/>
+        <w:spacing w:after="80"/>
+      </w:pPr>
+      <w:r>
+        <w:t>Custom arrangements may require additional lead time and arranging fees.</w:t>
+      </w:r>
+    </w:p>
+    <w:p>
+      <w:pPr>
+        <w:pStyle w:val="ListBullet"/>
+        <w:spacing w:after="80"/>
+      </w:pPr>
+      <w:r>
+        <w:t>Keep ceremony cues, announcements, and special moments in one final run-of-show.</w:t>
       </w:r>
     </w:p>
     <w:p>
@@ -41,12 +1500,79 @@
         <w:pStyle w:val="Heading1"/>
       </w:pPr>
       <w:r>
-        <w:t>Welcome Letter</w:t>
+        <w:rPr>
+          <w:rFonts w:ascii="Georgia" w:hAnsi="Georgia"/>
+          <w:color w:val="263F38"/>
+        </w:rPr>
+        <w:t>FAQ</w:t>
+      </w:r>
+    </w:p>
+    <w:p>
+      <w:pPr>
+        <w:pStyle w:val="Heading2"/>
+      </w:pPr>
+      <w:r>
+        <w:rPr>
+          <w:rFonts w:ascii="Georgia" w:hAnsi="Georgia"/>
+          <w:color w:val="263F38"/>
+        </w:rPr>
+        <w:t>Can we request songs?</w:t>
       </w:r>
     </w:p>
     <w:p>
       <w:r>
-        <w:t>Thank you for considering Reid Poole Music for your event. This packet is designed to make the booking process clear, warm, and organized so the music supports the tone of the day without adding stress. Use the placeholders throughout this document to create a polished agreement and planning packet for each client.</w:t>
+        <w:t>Yes. Standard requests are welcome. Custom arrangements require advance notice and may include an arranging fee.</w:t>
+      </w:r>
+    </w:p>
+    <w:p>
+      <w:pPr>
+        <w:pStyle w:val="Heading2"/>
+      </w:pPr>
+      <w:r>
+        <w:rPr>
+          <w:rFonts w:ascii="Georgia" w:hAnsi="Georgia"/>
+          <w:color w:val="263F38"/>
+        </w:rPr>
+        <w:t>Can you play outdoors?</w:t>
+      </w:r>
+    </w:p>
+    <w:p>
+      <w:r>
+        <w:t>Yes, when weather protection, shade, power, and a stable performance surface are provided.</w:t>
+      </w:r>
+    </w:p>
+    <w:p>
+      <w:pPr>
+        <w:pStyle w:val="Heading2"/>
+      </w:pPr>
+      <w:r>
+        <w:rPr>
+          <w:rFonts w:ascii="Georgia" w:hAnsi="Georgia"/>
+          <w:color w:val="263F38"/>
+        </w:rPr>
+        <w:t>Do you bring sound?</w:t>
+      </w:r>
+    </w:p>
+    <w:p>
+      <w:r>
+        <w:t>Small sound can often be included. Larger rooms, outdoor stages, or full-band events may require production support.</w:t>
+      </w:r>
+    </w:p>
+    <w:p>
+      <w:pPr>
+        <w:pStyle w:val="Heading2"/>
+      </w:pPr>
+      <w:r>
+        <w:rPr>
+          <w:rFonts w:ascii="Georgia" w:hAnsi="Georgia"/>
+          <w:color w:val="263F38"/>
+        </w:rPr>
+        <w:t>When should final details be due?</w:t>
+      </w:r>
+    </w:p>
+    <w:p>
+      <w:r>
+        <w:t>Two weeks before the event is ideal so the music plan, schedule, and logistics are clean.</w:t>
       </w:r>
     </w:p>
     <w:p>
@@ -54,1163 +1580,26 @@
         <w:pStyle w:val="Heading1"/>
       </w:pPr>
       <w:r>
-        <w:t>Performance Agreement</w:t>
-      </w:r>
-    </w:p>
-    <w:p>
-      <w:r>
-        <w:t>This Performance Agreement is between Reid Poole Music (Performer) and the client listed below.</w:t>
-      </w:r>
-    </w:p>
-    <w:p>
-      <w:pPr>
-        <w:pStyle w:val="Heading2"/>
-      </w:pPr>
-      <w:r>
-        <w:t>Client and Event Details</w:t>
-      </w:r>
-    </w:p>
-    <w:tbl>
-      <w:tblPr>
-        <w:tblStyle w:val="TableGrid"/>
-        <w:tblW w:type="auto" w:w="0"/>
-        <w:tblLook w:firstColumn="1" w:firstRow="1" w:lastColumn="0" w:lastRow="0" w:noHBand="0" w:noVBand="1" w:val="04A0"/>
-      </w:tblPr>
-      <w:tblGrid>
-        <w:gridCol w:w="5112"/>
-        <w:gridCol w:w="5112"/>
-      </w:tblGrid>
-      <w:tr>
-        <w:tc>
-          <w:tcPr>
-            <w:tcW w:type="dxa" w:w="5112"/>
-          </w:tcPr>
-          <w:p>
-            <w:r>
-              <w:t>Client name</w:t>
-            </w:r>
-          </w:p>
-        </w:tc>
-        <w:tc>
-          <w:tcPr>
-            <w:tcW w:type="dxa" w:w="5112"/>
-          </w:tcPr>
-          <w:p>
-            <w:r>
-              <w:t>{{CLIENT_NAME}}</w:t>
-            </w:r>
-          </w:p>
-        </w:tc>
-      </w:tr>
-      <w:tr>
-        <w:tc>
-          <w:tcPr>
-            <w:tcW w:type="dxa" w:w="5112"/>
-          </w:tcPr>
-          <w:p>
-            <w:r>
-              <w:t>Event type</w:t>
-            </w:r>
-          </w:p>
-        </w:tc>
-        <w:tc>
-          <w:tcPr>
-            <w:tcW w:type="dxa" w:w="5112"/>
-          </w:tcPr>
-          <w:p>
-            <w:r>
-              <w:t>{{EVENT_TYPE}}</w:t>
-            </w:r>
-          </w:p>
-        </w:tc>
-      </w:tr>
-      <w:tr>
-        <w:tc>
-          <w:tcPr>
-            <w:tcW w:type="dxa" w:w="5112"/>
-          </w:tcPr>
-          <w:p>
-            <w:r>
-              <w:t>Event date</w:t>
-            </w:r>
-          </w:p>
-        </w:tc>
-        <w:tc>
-          <w:tcPr>
-            <w:tcW w:type="dxa" w:w="5112"/>
-          </w:tcPr>
-          <w:p>
-            <w:r>
-              <w:t>{{EVENT_DATE}}</w:t>
-            </w:r>
-          </w:p>
-        </w:tc>
-      </w:tr>
-      <w:tr>
-        <w:tc>
-          <w:tcPr>
-            <w:tcW w:type="dxa" w:w="5112"/>
-          </w:tcPr>
-          <w:p>
-            <w:r>
-              <w:t>Venue</w:t>
-            </w:r>
-          </w:p>
-        </w:tc>
-        <w:tc>
-          <w:tcPr>
-            <w:tcW w:type="dxa" w:w="5112"/>
-          </w:tcPr>
-          <w:p>
-            <w:r>
-              <w:t>{{VENUE_NAME}}</w:t>
-            </w:r>
-          </w:p>
-        </w:tc>
-      </w:tr>
-      <w:tr>
-        <w:tc>
-          <w:tcPr>
-            <w:tcW w:type="dxa" w:w="5112"/>
-          </w:tcPr>
-          <w:p>
-            <w:r>
-              <w:t>Venue address</w:t>
-            </w:r>
-          </w:p>
-        </w:tc>
-        <w:tc>
-          <w:tcPr>
-            <w:tcW w:type="dxa" w:w="5112"/>
-          </w:tcPr>
-          <w:p>
-            <w:r>
-              <w:t>{{VENUE_ADDRESS}}</w:t>
-            </w:r>
-          </w:p>
-        </w:tc>
-      </w:tr>
-      <w:tr>
-        <w:tc>
-          <w:tcPr>
-            <w:tcW w:type="dxa" w:w="5112"/>
-          </w:tcPr>
-          <w:p>
-            <w:r>
-              <w:t>Primary contact</w:t>
-            </w:r>
-          </w:p>
-        </w:tc>
-        <w:tc>
-          <w:tcPr>
-            <w:tcW w:type="dxa" w:w="5112"/>
-          </w:tcPr>
-          <w:p>
-            <w:r>
-              <w:t>{{PRIMARY_CONTACT}}</w:t>
-            </w:r>
-          </w:p>
-        </w:tc>
-      </w:tr>
-      <w:tr>
-        <w:tc>
-          <w:tcPr>
-            <w:tcW w:type="dxa" w:w="5112"/>
-          </w:tcPr>
-          <w:p>
-            <w:r>
-              <w:t>Phone</w:t>
-            </w:r>
-          </w:p>
-        </w:tc>
-        <w:tc>
-          <w:tcPr>
-            <w:tcW w:type="dxa" w:w="5112"/>
-          </w:tcPr>
-          <w:p>
-            <w:r>
-              <w:t>{{CLIENT_PHONE}}</w:t>
-            </w:r>
-          </w:p>
-        </w:tc>
-      </w:tr>
-      <w:tr>
-        <w:tc>
-          <w:tcPr>
-            <w:tcW w:type="dxa" w:w="5112"/>
-          </w:tcPr>
-          <w:p>
-            <w:r>
-              <w:t>Email</w:t>
-            </w:r>
-          </w:p>
-        </w:tc>
-        <w:tc>
-          <w:tcPr>
-            <w:tcW w:type="dxa" w:w="5112"/>
-          </w:tcPr>
-          <w:p>
-            <w:r>
-              <w:t>{{CLIENT_EMAIL}}</w:t>
-            </w:r>
-          </w:p>
-        </w:tc>
-      </w:tr>
-    </w:tbl>
-    <w:p>
-      <w:pPr>
-        <w:pStyle w:val="Heading2"/>
-      </w:pPr>
-      <w:r>
-        <w:t>Performance Details</w:t>
-      </w:r>
-    </w:p>
-    <w:tbl>
-      <w:tblPr>
-        <w:tblStyle w:val="TableGrid"/>
-        <w:tblW w:type="auto" w:w="0"/>
-        <w:tblLook w:firstColumn="1" w:firstRow="1" w:lastColumn="0" w:lastRow="0" w:noHBand="0" w:noVBand="1" w:val="04A0"/>
-      </w:tblPr>
-      <w:tblGrid>
-        <w:gridCol w:w="5112"/>
-        <w:gridCol w:w="5112"/>
-      </w:tblGrid>
-      <w:tr>
-        <w:tc>
-          <w:tcPr>
-            <w:tcW w:type="dxa" w:w="5112"/>
-          </w:tcPr>
-          <w:p>
-            <w:r>
-              <w:t>Ensemble</w:t>
-            </w:r>
-          </w:p>
-        </w:tc>
-        <w:tc>
-          <w:tcPr>
-            <w:tcW w:type="dxa" w:w="5112"/>
-          </w:tcPr>
-          <w:p>
-            <w:r>
-              <w:t>{{ENSEMBLE_SIZE_AND_NAME}}</w:t>
-            </w:r>
-          </w:p>
-        </w:tc>
-      </w:tr>
-      <w:tr>
-        <w:tc>
-          <w:tcPr>
-            <w:tcW w:type="dxa" w:w="5112"/>
-          </w:tcPr>
-          <w:p>
-            <w:r>
-              <w:t>Performance time</w:t>
-            </w:r>
-          </w:p>
-        </w:tc>
-        <w:tc>
-          <w:tcPr>
-            <w:tcW w:type="dxa" w:w="5112"/>
-          </w:tcPr>
-          <w:p>
-            <w:r>
-              <w:t>{{PERFORMANCE_START}} to {{PERFORMANCE_END}}</w:t>
-            </w:r>
-          </w:p>
-        </w:tc>
-      </w:tr>
-      <w:tr>
-        <w:tc>
-          <w:tcPr>
-            <w:tcW w:type="dxa" w:w="5112"/>
-          </w:tcPr>
-          <w:p>
-            <w:r>
-              <w:t>Number of sets</w:t>
-            </w:r>
-          </w:p>
-        </w:tc>
-        <w:tc>
-          <w:tcPr>
-            <w:tcW w:type="dxa" w:w="5112"/>
-          </w:tcPr>
-          <w:p>
-            <w:r>
-              <w:t>{{NUMBER_OF_SETS}}</w:t>
-            </w:r>
-          </w:p>
-        </w:tc>
-      </w:tr>
-      <w:tr>
-        <w:tc>
-          <w:tcPr>
-            <w:tcW w:type="dxa" w:w="5112"/>
-          </w:tcPr>
-          <w:p>
-            <w:r>
-              <w:t>Style</w:t>
-            </w:r>
-          </w:p>
-        </w:tc>
-        <w:tc>
-          <w:tcPr>
-            <w:tcW w:type="dxa" w:w="5112"/>
-          </w:tcPr>
-          <w:p>
-            <w:r>
-              <w:t>Swing / Lindy Hop / Charleston / Jump Blues / New Orleans / Jazz / Funk / Brass Band / Other</w:t>
-            </w:r>
-          </w:p>
-        </w:tc>
-      </w:tr>
-      <w:tr>
-        <w:tc>
-          <w:tcPr>
-            <w:tcW w:type="dxa" w:w="5112"/>
-          </w:tcPr>
-          <w:p>
-            <w:r>
-              <w:t>Special notes</w:t>
-            </w:r>
-          </w:p>
-        </w:tc>
-        <w:tc>
-          <w:tcPr>
-            <w:tcW w:type="dxa" w:w="5112"/>
-          </w:tcPr>
-          <w:p>
-            <w:r>
-              <w:t>{{SPECIAL_NOTES}}</w:t>
-            </w:r>
-          </w:p>
-        </w:tc>
-      </w:tr>
-    </w:tbl>
-    <w:p>
-      <w:pPr>
-        <w:pStyle w:val="Heading2"/>
-      </w:pPr>
-      <w:r>
-        <w:t>Financial Agreement</w:t>
-      </w:r>
-    </w:p>
-    <w:tbl>
-      <w:tblPr>
-        <w:tblStyle w:val="TableGrid"/>
-        <w:tblW w:type="auto" w:w="0"/>
-        <w:tblLook w:firstColumn="1" w:firstRow="1" w:lastColumn="0" w:lastRow="0" w:noHBand="0" w:noVBand="1" w:val="04A0"/>
-      </w:tblPr>
-      <w:tblGrid>
-        <w:gridCol w:w="5112"/>
-        <w:gridCol w:w="5112"/>
-      </w:tblGrid>
-      <w:tr>
-        <w:tc>
-          <w:tcPr>
-            <w:tcW w:type="dxa" w:w="5112"/>
-          </w:tcPr>
-          <w:p>
-            <w:r>
-              <w:t>Performance fee</w:t>
-            </w:r>
-          </w:p>
-        </w:tc>
-        <w:tc>
-          <w:tcPr>
-            <w:tcW w:type="dxa" w:w="5112"/>
-          </w:tcPr>
-          <w:p>
-            <w:r>
-              <w:t>${{PERFORMANCE_FEE}}</w:t>
-            </w:r>
-          </w:p>
-        </w:tc>
-      </w:tr>
-      <w:tr>
-        <w:tc>
-          <w:tcPr>
-            <w:tcW w:type="dxa" w:w="5112"/>
-          </w:tcPr>
-          <w:p>
-            <w:r>
-              <w:t>Sound system</w:t>
-            </w:r>
-          </w:p>
-        </w:tc>
-        <w:tc>
-          <w:tcPr>
-            <w:tcW w:type="dxa" w:w="5112"/>
-          </w:tcPr>
-          <w:p>
-            <w:r>
-              <w:t>${{SOUND_SYSTEM_FEE}}</w:t>
-            </w:r>
-          </w:p>
-        </w:tc>
-      </w:tr>
-      <w:tr>
-        <w:tc>
-          <w:tcPr>
-            <w:tcW w:type="dxa" w:w="5112"/>
-          </w:tcPr>
-          <w:p>
-            <w:r>
-              <w:t>Booking / management fee</w:t>
-            </w:r>
-          </w:p>
-        </w:tc>
-        <w:tc>
-          <w:tcPr>
-            <w:tcW w:type="dxa" w:w="5112"/>
-          </w:tcPr>
-          <w:p>
-            <w:r>
-              <w:t>${{BOOKING_FEE}}</w:t>
-            </w:r>
-          </w:p>
-        </w:tc>
-      </w:tr>
-      <w:tr>
-        <w:tc>
-          <w:tcPr>
-            <w:tcW w:type="dxa" w:w="5112"/>
-          </w:tcPr>
-          <w:p>
-            <w:r>
-              <w:t>Other</w:t>
-            </w:r>
-          </w:p>
-        </w:tc>
-        <w:tc>
-          <w:tcPr>
-            <w:tcW w:type="dxa" w:w="5112"/>
-          </w:tcPr>
-          <w:p>
-            <w:r>
-              <w:t>${{OTHER_FEE}}</w:t>
-            </w:r>
-          </w:p>
-        </w:tc>
-      </w:tr>
-      <w:tr>
-        <w:tc>
-          <w:tcPr>
-            <w:tcW w:type="dxa" w:w="5112"/>
-          </w:tcPr>
-          <w:p>
-            <w:r>
-              <w:t>Total fee</w:t>
-            </w:r>
-          </w:p>
-        </w:tc>
-        <w:tc>
-          <w:tcPr>
-            <w:tcW w:type="dxa" w:w="5112"/>
-          </w:tcPr>
-          <w:p>
-            <w:r>
-              <w:t>${{TOTAL_FEE}}</w:t>
-            </w:r>
-          </w:p>
-        </w:tc>
-      </w:tr>
-      <w:tr>
-        <w:tc>
-          <w:tcPr>
-            <w:tcW w:type="dxa" w:w="5112"/>
-          </w:tcPr>
-          <w:p>
-            <w:r>
-              <w:t>Deposit amount</w:t>
-            </w:r>
-          </w:p>
-        </w:tc>
-        <w:tc>
-          <w:tcPr>
-            <w:tcW w:type="dxa" w:w="5112"/>
-          </w:tcPr>
-          <w:p>
-            <w:r>
-              <w:t>${{DEPOSIT_AMOUNT}}</w:t>
-            </w:r>
-          </w:p>
-        </w:tc>
-      </w:tr>
-      <w:tr>
-        <w:tc>
-          <w:tcPr>
-            <w:tcW w:type="dxa" w:w="5112"/>
-          </w:tcPr>
-          <w:p>
-            <w:r>
-              <w:t>Remaining balance</w:t>
-            </w:r>
-          </w:p>
-        </w:tc>
-        <w:tc>
-          <w:tcPr>
-            <w:tcW w:type="dxa" w:w="5112"/>
-          </w:tcPr>
-          <w:p>
-            <w:r>
-              <w:t>${{BALANCE_DUE}}</w:t>
-            </w:r>
-          </w:p>
-        </w:tc>
-      </w:tr>
-    </w:tbl>
-    <w:p>
-      <w:pPr>
-        <w:pStyle w:val="Heading2"/>
-      </w:pPr>
-      <w:r>
-        <w:t>What Reid Poole Music Provides</w:t>
-      </w:r>
-    </w:p>
-    <w:p>
-      <w:pPr>
-        <w:pStyle w:val="ListBullet"/>
-      </w:pPr>
-      <w:r>
-        <w:t>Professional musicians prepared for the event style and timeline.</w:t>
-      </w:r>
-    </w:p>
-    <w:p>
-      <w:pPr>
-        <w:pStyle w:val="ListBullet"/>
-      </w:pPr>
-      <w:r>
-        <w:t>Sound system when contracted.</w:t>
-      </w:r>
-    </w:p>
-    <w:p>
-      <w:pPr>
-        <w:pStyle w:val="ListBullet"/>
-      </w:pPr>
-      <w:r>
-        <w:t>Setup and teardown.</w:t>
-      </w:r>
-    </w:p>
-    <w:p>
-      <w:pPr>
-        <w:pStyle w:val="ListBullet"/>
-      </w:pPr>
-      <w:r>
-        <w:t>MC announcements as needed.</w:t>
-      </w:r>
-    </w:p>
-    <w:p>
-      <w:pPr>
-        <w:pStyle w:val="ListBullet"/>
-      </w:pPr>
-      <w:r>
-        <w:t>Professional attire appropriate to the event.</w:t>
-      </w:r>
-    </w:p>
-    <w:p>
-      <w:pPr>
-        <w:pStyle w:val="Heading2"/>
-      </w:pPr>
-      <w:r>
-        <w:t>Client Responsibilities</w:t>
-      </w:r>
-    </w:p>
-    <w:p>
-      <w:pPr>
-        <w:pStyle w:val="ListBullet"/>
-      </w:pPr>
-      <w:r>
-        <w:t>Safe, level performance area.</w:t>
-      </w:r>
-    </w:p>
-    <w:p>
-      <w:pPr>
-        <w:pStyle w:val="ListBullet"/>
-      </w:pPr>
-      <w:r>
-        <w:t>Electrical power within 50 feet of the performance area.</w:t>
-      </w:r>
-    </w:p>
-    <w:p>
-      <w:pPr>
-        <w:pStyle w:val="ListBullet"/>
-      </w:pPr>
-      <w:r>
-        <w:t>Weather protection for outdoor events.</w:t>
-      </w:r>
-    </w:p>
-    <w:p>
-      <w:pPr>
-        <w:pStyle w:val="ListBullet"/>
-      </w:pPr>
-      <w:r>
-        <w:t>Chairs for musicians when appropriate.</w:t>
-      </w:r>
-    </w:p>
-    <w:p>
-      <w:pPr>
-        <w:pStyle w:val="ListBullet"/>
-      </w:pPr>
-      <w:r>
-        <w:t>Parking and loading access.</w:t>
-      </w:r>
-    </w:p>
-    <w:p>
-      <w:pPr>
-        <w:pStyle w:val="ListBullet"/>
-      </w:pPr>
-      <w:r>
-        <w:t>Water and meal support for events exceeding four hours.</w:t>
-      </w:r>
-    </w:p>
-    <w:p>
-      <w:pPr>
-        <w:pStyle w:val="Heading2"/>
-      </w:pPr>
-      <w:r>
-        <w:t>Song Requests and Custom Arrangements</w:t>
-      </w:r>
-    </w:p>
-    <w:p>
-      <w:pPr>
-        <w:pStyle w:val="ListBullet"/>
-      </w:pPr>
-      <w:r>
-        <w:t>Songs already in the repertoire are included whenever possible.</w:t>
-      </w:r>
-    </w:p>
-    <w:p>
-      <w:pPr>
-        <w:pStyle w:val="ListBullet"/>
-      </w:pPr>
-      <w:r>
-        <w:t>Custom arrangements are available for $40 per song when requested at least 30 days before the event.</w:t>
-      </w:r>
-    </w:p>
-    <w:p>
-      <w:pPr>
-        <w:pStyle w:val="ListBullet"/>
-      </w:pPr>
-      <w:r>
-        <w:t>Must-play and do-not-play songs should be submitted with the final questionnaire.</w:t>
-      </w:r>
-    </w:p>
-    <w:p>
-      <w:pPr>
-        <w:pStyle w:val="Heading2"/>
-      </w:pPr>
-      <w:r>
-        <w:t>Personnel</w:t>
-      </w:r>
-    </w:p>
-    <w:p>
-      <w:pPr>
-        <w:pStyle w:val="ListBullet"/>
-      </w:pPr>
-      <w:r>
-        <w:t>Specific musicians are not guaranteed. Equivalent professional substitutes may be used if necessary while maintaining instrumentation and quality.</w:t>
-      </w:r>
-    </w:p>
-    <w:p>
-      <w:pPr>
-        <w:pStyle w:val="Heading2"/>
-      </w:pPr>
-      <w:r>
-        <w:t>Weather, Delays, and Overtime</w:t>
-      </w:r>
-    </w:p>
-    <w:p>
-      <w:pPr>
-        <w:pStyle w:val="ListBullet"/>
-      </w:pPr>
-      <w:r>
-        <w:t>Outdoor events require adequate protection from weather. If unsafe conditions arise, the performance may be delayed, relocated, or paused.</w:t>
-      </w:r>
-    </w:p>
-    <w:p>
-      <w:pPr>
-        <w:pStyle w:val="ListBullet"/>
-      </w:pPr>
-      <w:r>
-        <w:t>Additional performance time beyond the contracted end time is billed at $250 per half hour, subject to availability.</w:t>
-      </w:r>
-    </w:p>
-    <w:p>
-      <w:pPr>
-        <w:pStyle w:val="Heading2"/>
-      </w:pPr>
-      <w:r>
-        <w:t>Cancellation</w:t>
-      </w:r>
-    </w:p>
-    <w:p>
-      <w:pPr>
-        <w:pStyle w:val="ListBullet"/>
-      </w:pPr>
-      <w:r>
-        <w:t>Deposits are non-refundable.</w:t>
-      </w:r>
-    </w:p>
-    <w:p>
-      <w:pPr>
-        <w:pStyle w:val="ListBullet"/>
-      </w:pPr>
-      <w:r>
-        <w:t>Cancellations within 30 days may require payment of the remaining balance unless otherwise agreed.</w:t>
-      </w:r>
-    </w:p>
-    <w:p>
-      <w:pPr>
-        <w:pStyle w:val="ListBullet"/>
-      </w:pPr>
-      <w:r>
-        <w:t>If the performer must cancel due to an emergency, all payments received will be refunded.</w:t>
-      </w:r>
-    </w:p>
-    <w:p>
-      <w:pPr>
-        <w:pStyle w:val="Heading2"/>
-      </w:pPr>
-      <w:r>
-        <w:t>Photo and Video</w:t>
-      </w:r>
-    </w:p>
-    <w:p>
-      <w:pPr>
-        <w:pStyle w:val="ListBullet"/>
-      </w:pPr>
-      <w:r>
-        <w:t>The performer may use photos or short video clips for promotional purposes unless the client requests otherwise in writing.</w:t>
-      </w:r>
-    </w:p>
-    <w:p>
-      <w:pPr>
-        <w:pStyle w:val="Heading2"/>
-      </w:pPr>
-      <w:r>
-        <w:t>Acceptance and Signatures</w:t>
-      </w:r>
-    </w:p>
-    <w:p>
-      <w:r>
-        <w:t>Client Signature: ________________________________    Date: _______________</w:t>
-      </w:r>
-    </w:p>
-    <w:p>
-      <w:r>
-        <w:t>Reid Poole Signature: ____________________________    Date: _______________</w:t>
-      </w:r>
-    </w:p>
-    <w:p>
-      <w:r>
-        <w:br w:type="page"/>
-      </w:r>
-    </w:p>
-    <w:p>
-      <w:pPr>
-        <w:pStyle w:val="Heading1"/>
-      </w:pPr>
-      <w:r>
-        <w:t>Wedding Music Planning Questionnaire</w:t>
-      </w:r>
-    </w:p>
-    <w:p>
-      <w:r>
-        <w:t>Wedding planner/contact:</w:t>
-      </w:r>
-    </w:p>
-    <w:p>
-      <w:r>
-        <w:t>______________________________________________________________________________________</w:t>
-      </w:r>
-    </w:p>
-    <w:p>
-      <w:r>
-        <w:t>Ceremony music needed? If yes, describe:</w:t>
-      </w:r>
-    </w:p>
-    <w:p>
-      <w:r>
-        <w:t>______________________________________________________________________________________</w:t>
-      </w:r>
-    </w:p>
-    <w:p>
-      <w:r>
-        <w:t>Cocktail hour music:</w:t>
-      </w:r>
-    </w:p>
-    <w:p>
-      <w:r>
-        <w:t>______________________________________________________________________________________</w:t>
-      </w:r>
-    </w:p>
-    <w:p>
-      <w:r>
-        <w:t>Reception start time:</w:t>
-      </w:r>
-    </w:p>
-    <w:p>
-      <w:r>
-        <w:t>______________________________________________________________________________________</w:t>
-      </w:r>
-    </w:p>
-    <w:p>
-      <w:r>
-        <w:t>Grand entrance song:</w:t>
-      </w:r>
-    </w:p>
-    <w:p>
-      <w:r>
-        <w:t>______________________________________________________________________________________</w:t>
-      </w:r>
-    </w:p>
-    <w:p>
-      <w:r>
-        <w:t>First dance:</w:t>
-      </w:r>
-    </w:p>
-    <w:p>
-      <w:r>
-        <w:t>______________________________________________________________________________________</w:t>
-      </w:r>
-    </w:p>
-    <w:p>
-      <w:r>
-        <w:t>Father/Daughter dance:</w:t>
-      </w:r>
-    </w:p>
-    <w:p>
-      <w:r>
-        <w:t>______________________________________________________________________________________</w:t>
-      </w:r>
-    </w:p>
-    <w:p>
-      <w:r>
-        <w:t>Mother/Son dance:</w:t>
-      </w:r>
-    </w:p>
-    <w:p>
-      <w:r>
-        <w:t>______________________________________________________________________________________</w:t>
-      </w:r>
-    </w:p>
-    <w:p>
-      <w:r>
-        <w:t>Cake cutting song:</w:t>
-      </w:r>
-    </w:p>
-    <w:p>
-      <w:r>
-        <w:t>______________________________________________________________________________________</w:t>
-      </w:r>
-    </w:p>
-    <w:p>
-      <w:r>
-        <w:t>Last dance:</w:t>
-      </w:r>
-    </w:p>
-    <w:p>
-      <w:r>
-        <w:t>______________________________________________________________________________________</w:t>
-      </w:r>
-    </w:p>
-    <w:p>
-      <w:r>
-        <w:t>Must-play songs:</w:t>
-      </w:r>
-    </w:p>
-    <w:p>
-      <w:r>
-        <w:t>______________________________________________________________________________________</w:t>
-      </w:r>
-    </w:p>
-    <w:p>
-      <w:r>
-        <w:t>Do-not-play songs:</w:t>
-      </w:r>
-    </w:p>
-    <w:p>
-      <w:r>
-        <w:t>______________________________________________________________________________________</w:t>
-      </w:r>
-    </w:p>
-    <w:p>
-      <w:r>
-        <w:t>Special dedications or announcements:</w:t>
-      </w:r>
-    </w:p>
-    <w:p>
-      <w:r>
-        <w:t>______________________________________________________________________________________</w:t>
-      </w:r>
-    </w:p>
-    <w:p>
-      <w:r>
-        <w:t>Timeline or special moments:</w:t>
-      </w:r>
-    </w:p>
-    <w:p>
-      <w:r>
-        <w:t>______________________________________________________________________________________</w:t>
-      </w:r>
-    </w:p>
-    <w:p>
-      <w:r>
-        <w:t>Venue load-in instructions:</w:t>
-      </w:r>
-    </w:p>
-    <w:p>
-      <w:r>
-        <w:t>______________________________________________________________________________________</w:t>
-      </w:r>
-    </w:p>
-    <w:p>
-      <w:r>
-        <w:t>Power available near performance area?:</w:t>
-      </w:r>
-    </w:p>
-    <w:p>
-      <w:r>
-        <w:t>______________________________________________________________________________________</w:t>
-      </w:r>
-    </w:p>
-    <w:p>
-      <w:r>
-        <w:t>Accessibility or parking notes:</w:t>
-      </w:r>
-    </w:p>
-    <w:p>
-      <w:r>
-        <w:t>______________________________________________________________________________________</w:t>
-      </w:r>
-    </w:p>
-    <w:p>
-      <w:r>
-        <w:t>Other notes:</w:t>
-      </w:r>
-    </w:p>
-    <w:p>
-      <w:r>
-        <w:t>______________________________________________________________________________________</w:t>
-      </w:r>
-    </w:p>
-    <w:p>
-      <w:r>
-        <w:br w:type="page"/>
-      </w:r>
-    </w:p>
-    <w:p>
-      <w:pPr>
-        <w:pStyle w:val="Heading1"/>
-      </w:pPr>
-      <w:r>
-        <w:t>Sample Set Lists</w:t>
-      </w:r>
-    </w:p>
-    <w:p>
-      <w:pPr>
-        <w:pStyle w:val="Heading2"/>
-      </w:pPr>
-      <w:r>
-        <w:t>East Coast Swing / Night Owls</w:t>
-      </w:r>
-    </w:p>
-    <w:p>
-      <w:pPr>
-        <w:pStyle w:val="ListBullet"/>
-      </w:pPr>
-      <w:r>
-        <w:t>Jump, Jive an Wail</w:t>
-      </w:r>
-    </w:p>
-    <w:p>
-      <w:pPr>
-        <w:pStyle w:val="ListBullet"/>
-      </w:pPr>
-      <w:r>
-        <w:t>On the Sunny Side of the Street</w:t>
-      </w:r>
-    </w:p>
-    <w:p>
-      <w:pPr>
-        <w:pStyle w:val="ListBullet"/>
-      </w:pPr>
-      <w:r>
-        <w:t>Bei Mir Bist Du Schoen</w:t>
-      </w:r>
-    </w:p>
-    <w:p>
-      <w:pPr>
-        <w:pStyle w:val="ListBullet"/>
-      </w:pPr>
-      <w:r>
-        <w:t>All of Me</w:t>
-      </w:r>
-    </w:p>
-    <w:p>
-      <w:pPr>
-        <w:pStyle w:val="ListBullet"/>
-      </w:pPr>
-      <w:r>
-        <w:t>Is You Is or Is You Ain't My Baby</w:t>
-      </w:r>
-    </w:p>
-    <w:p>
-      <w:pPr>
-        <w:pStyle w:val="ListBullet"/>
-      </w:pPr>
-      <w:r>
-        <w:t>When the Saints Go Marching In</w:t>
-      </w:r>
-    </w:p>
-    <w:p>
-      <w:pPr>
-        <w:pStyle w:val="Heading2"/>
-      </w:pPr>
-      <w:r>
-        <w:t>Funk Brass Band / Poole and the Gang</w:t>
-      </w:r>
-    </w:p>
-    <w:p>
-      <w:pPr>
-        <w:pStyle w:val="ListBullet"/>
-      </w:pPr>
-      <w:r>
-        <w:t>Cissy Strut</w:t>
-      </w:r>
-    </w:p>
-    <w:p>
-      <w:pPr>
-        <w:pStyle w:val="ListBullet"/>
-      </w:pPr>
-      <w:r>
-        <w:t>I Feel Good</w:t>
-      </w:r>
-    </w:p>
-    <w:p>
-      <w:pPr>
-        <w:pStyle w:val="ListBullet"/>
-      </w:pPr>
-      <w:r>
-        <w:t>Tell Me Something Good</w:t>
-      </w:r>
-    </w:p>
-    <w:p>
-      <w:pPr>
-        <w:pStyle w:val="ListBullet"/>
-      </w:pPr>
-      <w:r>
-        <w:t>Chameleon</w:t>
-      </w:r>
-    </w:p>
-    <w:p>
-      <w:pPr>
-        <w:pStyle w:val="ListBullet"/>
-      </w:pPr>
-      <w:r>
-        <w:t>Ain't No Sunshine</w:t>
-      </w:r>
-    </w:p>
-    <w:p>
-      <w:pPr>
-        <w:pStyle w:val="ListBullet"/>
-      </w:pPr>
-      <w:r>
-        <w:t>Feel Like Funkin It Up</w:t>
-      </w:r>
-    </w:p>
-    <w:p>
-      <w:pPr>
-        <w:pStyle w:val="Heading1"/>
-      </w:pPr>
-      <w:r>
-        <w:t>Song Request Guide</w:t>
-      </w:r>
-    </w:p>
-    <w:p>
-      <w:r>
-        <w:t>Share must-play songs, do-not-play songs, and special moments as early as possible. If a song needs a custom arrangement, request it at least 30 days before the event. Final music notes are best delivered in one complete planning questionnaire.</w:t>
-      </w:r>
-    </w:p>
-    <w:p>
-      <w:pPr>
-        <w:pStyle w:val="Heading1"/>
-      </w:pPr>
-      <w:r>
-        <w:t>FAQ</w:t>
-      </w:r>
-    </w:p>
-    <w:p>
-      <w:r>
         <w:rPr>
-          <w:b/>
+          <w:rFonts w:ascii="Georgia" w:hAnsi="Georgia"/>
+          <w:color w:val="263F38"/>
         </w:rPr>
-        <w:t>When is the deposit due?</w:t>
-      </w:r>
-    </w:p>
-    <w:p>
-      <w:r>
-        <w:t>The date is reserved once the agreement is signed and the deposit is received.</w:t>
-      </w:r>
-    </w:p>
-    <w:p>
-      <w:r>
-        <w:rPr>
-          <w:b/>
-        </w:rPr>
-        <w:t>Can we request special songs?</w:t>
-      </w:r>
-    </w:p>
-    <w:p>
-      <w:r>
-        <w:t>Yes. Repertoire requests are included when possible. Custom arrangements require advance notice and may carry an arrangement fee.</w:t>
-      </w:r>
-    </w:p>
-    <w:p>
-      <w:r>
-        <w:rPr>
-          <w:b/>
-        </w:rPr>
-        <w:t>Do you provide sound?</w:t>
-      </w:r>
-    </w:p>
-    <w:p>
-      <w:r>
-        <w:t>Sound can be provided when contracted. Larger or unusual rooms may require venue-provided production.</w:t>
-      </w:r>
-    </w:p>
-    <w:p>
-      <w:r>
-        <w:rPr>
-          <w:b/>
-        </w:rPr>
-        <w:t>What happens if the event is outdoors?</w:t>
-      </w:r>
-    </w:p>
-    <w:p>
-      <w:r>
-        <w:t>A safe covered performance area and nearby power are required. Weather may require relocation or pause.</w:t>
-      </w:r>
-    </w:p>
-    <w:p>
-      <w:pPr>
-        <w:pStyle w:val="Heading1"/>
-      </w:pPr>
-      <w:r>
         <w:t>Final Checklist</w:t>
       </w:r>
     </w:p>
     <w:p>
       <w:pPr>
         <w:pStyle w:val="ListBullet"/>
+        <w:spacing w:after="80"/>
       </w:pPr>
       <w:r>
-        <w:t>Signed agreement received</w:t>
+        <w:t>Signed agreement returned</w:t>
       </w:r>
     </w:p>
     <w:p>
       <w:pPr>
         <w:pStyle w:val="ListBullet"/>
+        <w:spacing w:after="80"/>
       </w:pPr>
       <w:r>
         <w:t>Deposit received</w:t>
@@ -1219,38 +1608,25 @@
     <w:p>
       <w:pPr>
         <w:pStyle w:val="ListBullet"/>
+        <w:spacing w:after="80"/>
       </w:pPr>
       <w:r>
-        <w:t>Venue address confirmed</w:t>
+        <w:t>Venue contact confirmed</w:t>
       </w:r>
     </w:p>
     <w:p>
       <w:pPr>
         <w:pStyle w:val="ListBullet"/>
+        <w:spacing w:after="80"/>
       </w:pPr>
       <w:r>
-        <w:t>Load-in and parking confirmed</w:t>
+        <w:t>Schedule and performance windows confirmed</w:t>
       </w:r>
     </w:p>
     <w:p>
       <w:pPr>
         <w:pStyle w:val="ListBullet"/>
-      </w:pPr>
-      <w:r>
-        <w:t>Power and weather plan confirmed</w:t>
-      </w:r>
-    </w:p>
-    <w:p>
-      <w:pPr>
-        <w:pStyle w:val="ListBullet"/>
-      </w:pPr>
-      <w:r>
-        <w:t>Timeline finalized</w:t>
-      </w:r>
-    </w:p>
-    <w:p>
-      <w:pPr>
-        <w:pStyle w:val="ListBullet"/>
+        <w:spacing w:after="80"/>
       </w:pPr>
       <w:r>
         <w:t>Song requests finalized</w:t>
@@ -1259,14 +1635,41 @@
     <w:p>
       <w:pPr>
         <w:pStyle w:val="ListBullet"/>
+        <w:spacing w:after="80"/>
       </w:pPr>
       <w:r>
-        <w:t>Balance paid before first performance unless otherwise agreed</w:t>
+        <w:t>Load-in, parking, and power confirmed</w:t>
+      </w:r>
+    </w:p>
+    <w:p>
+      <w:pPr>
+        <w:pStyle w:val="ListBullet"/>
+        <w:spacing w:after="80"/>
+      </w:pPr>
+      <w:r>
+        <w:t>Remaining balance scheduled</w:t>
+      </w:r>
+    </w:p>
+    <w:p>
+      <w:pPr>
+        <w:pStyle w:val="Heading2"/>
+      </w:pPr>
+      <w:r>
+        <w:rPr>
+          <w:rFonts w:ascii="Georgia" w:hAnsi="Georgia"/>
+          <w:color w:val="263F38"/>
+        </w:rPr>
+        <w:t>Special notes</w:t>
+      </w:r>
+    </w:p>
+    <w:p>
+      <w:r>
+        <w:t>{{SPECIAL_NOTES}}</w:t>
       </w:r>
     </w:p>
     <w:sectPr>
       <w:pgSz w:w="12240" w:h="15840"/>
-      <w:pgMar w:top="1008" w:right="1008" w:bottom="1008" w:left="1008" w:header="720" w:footer="720" w:gutter="0"/>
+      <w:pgMar w:top="1008" w:right="1080" w:bottom="1008" w:left="1080" w:header="720" w:footer="720" w:gutter="0"/>
       <w:cols w:space="720"/>
       <w:docGrid w:linePitch="360"/>
     </w:sectPr>
@@ -1637,9 +2040,12 @@
     <w:name w:val="Normal"/>
     <w:qFormat/>
     <w:rsid w:val="00FC693F"/>
+    <w:pPr>
+      <w:spacing w:after="140"/>
+    </w:pPr>
     <w:rPr>
-      <w:rFonts w:ascii="Aptos" w:hAnsi="Aptos"/>
-      <w:sz w:val="21"/>
+      <w:rFonts w:ascii="Arial" w:hAnsi="Arial"/>
+      <w:sz w:val="20"/>
     </w:rPr>
   </w:style>
   <w:style w:type="paragraph" w:styleId="Header">

</xml_diff>